<commit_message>
Enhance visual design across Report, Web Dashboard, and Presentation
- Embedded 6 publication-grade 300 DPI figures and benchmark tables into Word (.docx) & PDF reports
- Modernized Streamlit web application (app.py) with SVG circular score gauges, elevated card shadows, and official team roll numbers
- Upgraded Review 3 presentation (AI_News_Credibility_Scorer_Review3.pptx) with embedded architecture diagram, UI mockup, and graphical Gantt chart
- All 16 automated pytest unit tests passing
</commit_message>
<xml_diff>
--- a/docs/TruthLens_Mini_Project_Report_CSS7102.docx
+++ b/docs/TruthLens_Mini_Project_Report_CSS7102.docx
@@ -1839,7 +1839,36 @@
           <w:b w:val="0"/>
           <w:sz w:val="20"/>
         </w:rPr>
-        <w:t xml:space="preserve">    5.3 Database Schema and Normalization</w:t>
+        <w:t xml:space="preserve">    5.3 Database Schema &amp; Knowledge Base Distributions</w:t>
+      </w:r>
+      <w:r>
+        <w:rPr>
+          <w:rFonts w:ascii="Times New Roman" w:hAnsi="Times New Roman"/>
+          <w:color w:val="969696"/>
+          <w:sz w:val="20"/>
+        </w:rPr>
+        <w:t xml:space="preserve"> ..................... </w:t>
+      </w:r>
+      <w:r>
+        <w:rPr>
+          <w:rFonts w:ascii="Times New Roman" w:hAnsi="Times New Roman"/>
+          <w:b w:val="0"/>
+          <w:sz w:val="20"/>
+        </w:rPr>
+        <w:t>10</w:t>
+      </w:r>
+    </w:p>
+    <w:p>
+      <w:pPr>
+        <w:spacing w:line="276" w:lineRule="auto" w:after="50"/>
+      </w:pPr>
+      <w:r>
+        <w:rPr>
+          <w:rFonts w:ascii="Times New Roman" w:hAnsi="Times New Roman"/>
+          <w:b/>
+          <w:sz w:val="20"/>
+        </w:rPr>
+        <w:t>CHAPTER 6  IMPLEMENTATION (50% MILESTONE)</w:t>
       </w:r>
       <w:r>
         <w:rPr>
@@ -1852,35 +1881,6 @@
       <w:r>
         <w:rPr>
           <w:rFonts w:ascii="Times New Roman" w:hAnsi="Times New Roman"/>
-          <w:b w:val="0"/>
-          <w:sz w:val="20"/>
-        </w:rPr>
-        <w:t>10</w:t>
-      </w:r>
-    </w:p>
-    <w:p>
-      <w:pPr>
-        <w:spacing w:line="276" w:lineRule="auto" w:after="50"/>
-      </w:pPr>
-      <w:r>
-        <w:rPr>
-          <w:rFonts w:ascii="Times New Roman" w:hAnsi="Times New Roman"/>
-          <w:b/>
-          <w:sz w:val="20"/>
-        </w:rPr>
-        <w:t>CHAPTER 6  IMPLEMENTATION (50% MILESTONE)</w:t>
-      </w:r>
-      <w:r>
-        <w:rPr>
-          <w:rFonts w:ascii="Times New Roman" w:hAnsi="Times New Roman"/>
-          <w:color w:val="969696"/>
-          <w:sz w:val="20"/>
-        </w:rPr>
-        <w:t xml:space="preserve"> .................................. </w:t>
-      </w:r>
-      <w:r>
-        <w:rPr>
-          <w:rFonts w:ascii="Times New Roman" w:hAnsi="Times New Roman"/>
           <w:b/>
           <w:sz w:val="20"/>
         </w:rPr>
@@ -2071,7 +2071,239 @@
           <w:b w:val="0"/>
           <w:sz w:val="20"/>
         </w:rPr>
-        <w:t xml:space="preserve">    7.1 Sub-Millisecond Database Latency Benchmarks</w:t>
+        <w:t xml:space="preserve">    7.1 Empirical Latency Benchmarks</w:t>
+      </w:r>
+      <w:r>
+        <w:rPr>
+          <w:rFonts w:ascii="Times New Roman" w:hAnsi="Times New Roman"/>
+          <w:color w:val="969696"/>
+          <w:sz w:val="20"/>
+        </w:rPr>
+        <w:t xml:space="preserve"> ....................................... </w:t>
+      </w:r>
+      <w:r>
+        <w:rPr>
+          <w:rFonts w:ascii="Times New Roman" w:hAnsi="Times New Roman"/>
+          <w:b w:val="0"/>
+          <w:sz w:val="20"/>
+        </w:rPr>
+        <w:t>14</w:t>
+      </w:r>
+    </w:p>
+    <w:p>
+      <w:pPr>
+        <w:spacing w:line="276" w:lineRule="auto" w:after="50"/>
+      </w:pPr>
+      <w:r>
+        <w:rPr>
+          <w:rFonts w:ascii="Times New Roman" w:hAnsi="Times New Roman"/>
+          <w:b w:val="0"/>
+          <w:sz w:val="20"/>
+        </w:rPr>
+        <w:t xml:space="preserve">    7.2 Automated Unit Testing Validation (16/16 Passed)</w:t>
+      </w:r>
+      <w:r>
+        <w:rPr>
+          <w:rFonts w:ascii="Times New Roman" w:hAnsi="Times New Roman"/>
+          <w:color w:val="969696"/>
+          <w:sz w:val="20"/>
+        </w:rPr>
+        <w:t xml:space="preserve"> ................... </w:t>
+      </w:r>
+      <w:r>
+        <w:rPr>
+          <w:rFonts w:ascii="Times New Roman" w:hAnsi="Times New Roman"/>
+          <w:b w:val="0"/>
+          <w:sz w:val="20"/>
+        </w:rPr>
+        <w:t>14</w:t>
+      </w:r>
+    </w:p>
+    <w:p>
+      <w:pPr>
+        <w:spacing w:line="276" w:lineRule="auto" w:after="50"/>
+      </w:pPr>
+      <w:r>
+        <w:rPr>
+          <w:rFonts w:ascii="Times New Roman" w:hAnsi="Times New Roman"/>
+          <w:b w:val="0"/>
+          <w:sz w:val="20"/>
+        </w:rPr>
+        <w:t xml:space="preserve">    7.3 50% Completed vs. Remaining 50% Engineering Division</w:t>
+      </w:r>
+      <w:r>
+        <w:rPr>
+          <w:rFonts w:ascii="Times New Roman" w:hAnsi="Times New Roman"/>
+          <w:color w:val="969696"/>
+          <w:sz w:val="20"/>
+        </w:rPr>
+        <w:t xml:space="preserve"> ............... </w:t>
+      </w:r>
+      <w:r>
+        <w:rPr>
+          <w:rFonts w:ascii="Times New Roman" w:hAnsi="Times New Roman"/>
+          <w:b w:val="0"/>
+          <w:sz w:val="20"/>
+        </w:rPr>
+        <w:t>15</w:t>
+      </w:r>
+    </w:p>
+    <w:p>
+      <w:pPr>
+        <w:spacing w:line="276" w:lineRule="auto" w:after="50"/>
+      </w:pPr>
+      <w:r>
+        <w:rPr>
+          <w:rFonts w:ascii="Times New Roman" w:hAnsi="Times New Roman"/>
+          <w:b/>
+          <w:sz w:val="20"/>
+        </w:rPr>
+        <w:t>CHAPTER 8  ETHICAL, LEGAL AND SUSTAINABILITY ASPECTS</w:t>
+      </w:r>
+      <w:r>
+        <w:rPr>
+          <w:rFonts w:ascii="Times New Roman" w:hAnsi="Times New Roman"/>
+          <w:color w:val="969696"/>
+          <w:sz w:val="20"/>
+        </w:rPr>
+        <w:t xml:space="preserve"> ....................... </w:t>
+      </w:r>
+      <w:r>
+        <w:rPr>
+          <w:rFonts w:ascii="Times New Roman" w:hAnsi="Times New Roman"/>
+          <w:b/>
+          <w:sz w:val="20"/>
+        </w:rPr>
+        <w:t>16</w:t>
+      </w:r>
+    </w:p>
+    <w:p>
+      <w:pPr>
+        <w:spacing w:line="276" w:lineRule="auto" w:after="50"/>
+      </w:pPr>
+      <w:r>
+        <w:rPr>
+          <w:rFonts w:ascii="Times New Roman" w:hAnsi="Times New Roman"/>
+          <w:b w:val="0"/>
+          <w:sz w:val="20"/>
+        </w:rPr>
+        <w:t xml:space="preserve">    8.1 Ethical Transparency and Bias Mitigation</w:t>
+      </w:r>
+      <w:r>
+        <w:rPr>
+          <w:rFonts w:ascii="Times New Roman" w:hAnsi="Times New Roman"/>
+          <w:color w:val="969696"/>
+          <w:sz w:val="20"/>
+        </w:rPr>
+        <w:t xml:space="preserve"> ........................... </w:t>
+      </w:r>
+      <w:r>
+        <w:rPr>
+          <w:rFonts w:ascii="Times New Roman" w:hAnsi="Times New Roman"/>
+          <w:b w:val="0"/>
+          <w:sz w:val="20"/>
+        </w:rPr>
+        <w:t>16</w:t>
+      </w:r>
+    </w:p>
+    <w:p>
+      <w:pPr>
+        <w:spacing w:line="276" w:lineRule="auto" w:after="50"/>
+      </w:pPr>
+      <w:r>
+        <w:rPr>
+          <w:rFonts w:ascii="Times New Roman" w:hAnsi="Times New Roman"/>
+          <w:b w:val="0"/>
+          <w:sz w:val="20"/>
+        </w:rPr>
+        <w:t xml:space="preserve">    8.2 Legal and Regulatory Compliance (DPDP Act 2023)</w:t>
+      </w:r>
+      <w:r>
+        <w:rPr>
+          <w:rFonts w:ascii="Times New Roman" w:hAnsi="Times New Roman"/>
+          <w:color w:val="969696"/>
+          <w:sz w:val="20"/>
+        </w:rPr>
+        <w:t xml:space="preserve"> .................... </w:t>
+      </w:r>
+      <w:r>
+        <w:rPr>
+          <w:rFonts w:ascii="Times New Roman" w:hAnsi="Times New Roman"/>
+          <w:b w:val="0"/>
+          <w:sz w:val="20"/>
+        </w:rPr>
+        <w:t>16</w:t>
+      </w:r>
+    </w:p>
+    <w:p>
+      <w:pPr>
+        <w:spacing w:line="276" w:lineRule="auto" w:after="50"/>
+      </w:pPr>
+      <w:r>
+        <w:rPr>
+          <w:rFonts w:ascii="Times New Roman" w:hAnsi="Times New Roman"/>
+          <w:b w:val="0"/>
+          <w:sz w:val="20"/>
+        </w:rPr>
+        <w:t xml:space="preserve">    8.3 Environmental Sustainability and Compute Efficiency</w:t>
+      </w:r>
+      <w:r>
+        <w:rPr>
+          <w:rFonts w:ascii="Times New Roman" w:hAnsi="Times New Roman"/>
+          <w:color w:val="969696"/>
+          <w:sz w:val="20"/>
+        </w:rPr>
+        <w:t xml:space="preserve"> ................ </w:t>
+      </w:r>
+      <w:r>
+        <w:rPr>
+          <w:rFonts w:ascii="Times New Roman" w:hAnsi="Times New Roman"/>
+          <w:b w:val="0"/>
+          <w:sz w:val="20"/>
+        </w:rPr>
+        <w:t>16</w:t>
+      </w:r>
+    </w:p>
+    <w:p>
+      <w:pPr>
+        <w:spacing w:line="276" w:lineRule="auto" w:after="50"/>
+      </w:pPr>
+      <w:r>
+        <w:rPr>
+          <w:rFonts w:ascii="Times New Roman" w:hAnsi="Times New Roman"/>
+          <w:b/>
+          <w:sz w:val="20"/>
+        </w:rPr>
+        <w:t>CHAPTER 9  CONCLUSION AND FUTURE WORK</w:t>
+      </w:r>
+      <w:r>
+        <w:rPr>
+          <w:rFonts w:ascii="Times New Roman" w:hAnsi="Times New Roman"/>
+          <w:color w:val="969696"/>
+          <w:sz w:val="20"/>
+        </w:rPr>
+        <w:t xml:space="preserve"> ...................................... </w:t>
+      </w:r>
+      <w:r>
+        <w:rPr>
+          <w:rFonts w:ascii="Times New Roman" w:hAnsi="Times New Roman"/>
+          <w:b/>
+          <w:sz w:val="20"/>
+        </w:rPr>
+        <w:t>17</w:t>
+      </w:r>
+    </w:p>
+    <w:p>
+      <w:pPr>
+        <w:spacing w:line="276" w:lineRule="auto" w:after="50"/>
+      </w:pPr>
+      <w:r>
+        <w:rPr>
+          <w:rFonts w:ascii="Times New Roman" w:hAnsi="Times New Roman"/>
+          <w:b w:val="0"/>
+          <w:sz w:val="20"/>
+        </w:rPr>
+        <w:t xml:space="preserve">    9.1 Conclusion on 50% Milestone Accomplishments</w:t>
       </w:r>
       <w:r>
         <w:rPr>
@@ -2087,7 +2319,7 @@
           <w:b w:val="0"/>
           <w:sz w:val="20"/>
         </w:rPr>
-        <w:t>14</w:t>
+        <w:t>17</w:t>
       </w:r>
     </w:p>
     <w:p>
@@ -2100,7 +2332,7 @@
           <w:b w:val="0"/>
           <w:sz w:val="20"/>
         </w:rPr>
-        <w:t xml:space="preserve">    7.2 Automated Unit Testing Validation (16/16 Passed)</w:t>
+        <w:t xml:space="preserve">    9.2 Upcoming Phase 4: RoBERTa-MNLI Transformer Integration</w:t>
       </w:r>
       <w:r>
         <w:rPr>
@@ -2108,239 +2340,7 @@
           <w:color w:val="969696"/>
           <w:sz w:val="20"/>
         </w:rPr>
-        <w:t xml:space="preserve"> ................... </w:t>
-      </w:r>
-      <w:r>
-        <w:rPr>
-          <w:rFonts w:ascii="Times New Roman" w:hAnsi="Times New Roman"/>
-          <w:b w:val="0"/>
-          <w:sz w:val="20"/>
-        </w:rPr>
-        <w:t>14</w:t>
-      </w:r>
-    </w:p>
-    <w:p>
-      <w:pPr>
-        <w:spacing w:line="276" w:lineRule="auto" w:after="50"/>
-      </w:pPr>
-      <w:r>
-        <w:rPr>
-          <w:rFonts w:ascii="Times New Roman" w:hAnsi="Times New Roman"/>
-          <w:b w:val="0"/>
-          <w:sz w:val="20"/>
-        </w:rPr>
-        <w:t xml:space="preserve">    7.3 Comparative Case Studies &amp; Real-World Validation</w:t>
-      </w:r>
-      <w:r>
-        <w:rPr>
-          <w:rFonts w:ascii="Times New Roman" w:hAnsi="Times New Roman"/>
-          <w:color w:val="969696"/>
-          <w:sz w:val="20"/>
-        </w:rPr>
-        <w:t xml:space="preserve"> ................... </w:t>
-      </w:r>
-      <w:r>
-        <w:rPr>
-          <w:rFonts w:ascii="Times New Roman" w:hAnsi="Times New Roman"/>
-          <w:b w:val="0"/>
-          <w:sz w:val="20"/>
-        </w:rPr>
-        <w:t>15</w:t>
-      </w:r>
-    </w:p>
-    <w:p>
-      <w:pPr>
-        <w:spacing w:line="276" w:lineRule="auto" w:after="50"/>
-      </w:pPr>
-      <w:r>
-        <w:rPr>
-          <w:rFonts w:ascii="Times New Roman" w:hAnsi="Times New Roman"/>
-          <w:b w:val="0"/>
-          <w:sz w:val="20"/>
-        </w:rPr>
-        <w:t xml:space="preserve">    7.4 50% Completed vs. Remaining 50% Engineering Division</w:t>
-      </w:r>
-      <w:r>
-        <w:rPr>
-          <w:rFonts w:ascii="Times New Roman" w:hAnsi="Times New Roman"/>
-          <w:color w:val="969696"/>
-          <w:sz w:val="20"/>
-        </w:rPr>
-        <w:t xml:space="preserve"> ............... </w:t>
-      </w:r>
-      <w:r>
-        <w:rPr>
-          <w:rFonts w:ascii="Times New Roman" w:hAnsi="Times New Roman"/>
-          <w:b w:val="0"/>
-          <w:sz w:val="20"/>
-        </w:rPr>
-        <w:t>15</w:t>
-      </w:r>
-    </w:p>
-    <w:p>
-      <w:pPr>
-        <w:spacing w:line="276" w:lineRule="auto" w:after="50"/>
-      </w:pPr>
-      <w:r>
-        <w:rPr>
-          <w:rFonts w:ascii="Times New Roman" w:hAnsi="Times New Roman"/>
-          <w:b/>
-          <w:sz w:val="20"/>
-        </w:rPr>
-        <w:t>CHAPTER 8  ETHICAL, LEGAL AND SUSTAINABILITY ASPECTS</w:t>
-      </w:r>
-      <w:r>
-        <w:rPr>
-          <w:rFonts w:ascii="Times New Roman" w:hAnsi="Times New Roman"/>
-          <w:color w:val="969696"/>
-          <w:sz w:val="20"/>
-        </w:rPr>
-        <w:t xml:space="preserve"> ....................... </w:t>
-      </w:r>
-      <w:r>
-        <w:rPr>
-          <w:rFonts w:ascii="Times New Roman" w:hAnsi="Times New Roman"/>
-          <w:b/>
-          <w:sz w:val="20"/>
-        </w:rPr>
-        <w:t>16</w:t>
-      </w:r>
-    </w:p>
-    <w:p>
-      <w:pPr>
-        <w:spacing w:line="276" w:lineRule="auto" w:after="50"/>
-      </w:pPr>
-      <w:r>
-        <w:rPr>
-          <w:rFonts w:ascii="Times New Roman" w:hAnsi="Times New Roman"/>
-          <w:b w:val="0"/>
-          <w:sz w:val="20"/>
-        </w:rPr>
-        <w:t xml:space="preserve">    8.1 Ethical Transparency and Bias Mitigation</w:t>
-      </w:r>
-      <w:r>
-        <w:rPr>
-          <w:rFonts w:ascii="Times New Roman" w:hAnsi="Times New Roman"/>
-          <w:color w:val="969696"/>
-          <w:sz w:val="20"/>
-        </w:rPr>
-        <w:t xml:space="preserve"> ........................... </w:t>
-      </w:r>
-      <w:r>
-        <w:rPr>
-          <w:rFonts w:ascii="Times New Roman" w:hAnsi="Times New Roman"/>
-          <w:b w:val="0"/>
-          <w:sz w:val="20"/>
-        </w:rPr>
-        <w:t>16</w:t>
-      </w:r>
-    </w:p>
-    <w:p>
-      <w:pPr>
-        <w:spacing w:line="276" w:lineRule="auto" w:after="50"/>
-      </w:pPr>
-      <w:r>
-        <w:rPr>
-          <w:rFonts w:ascii="Times New Roman" w:hAnsi="Times New Roman"/>
-          <w:b w:val="0"/>
-          <w:sz w:val="20"/>
-        </w:rPr>
-        <w:t xml:space="preserve">    8.2 Legal and Regulatory Compliance (DPDP Act 2023)</w:t>
-      </w:r>
-      <w:r>
-        <w:rPr>
-          <w:rFonts w:ascii="Times New Roman" w:hAnsi="Times New Roman"/>
-          <w:color w:val="969696"/>
-          <w:sz w:val="20"/>
-        </w:rPr>
-        <w:t xml:space="preserve"> .................... </w:t>
-      </w:r>
-      <w:r>
-        <w:rPr>
-          <w:rFonts w:ascii="Times New Roman" w:hAnsi="Times New Roman"/>
-          <w:b w:val="0"/>
-          <w:sz w:val="20"/>
-        </w:rPr>
-        <w:t>16</w:t>
-      </w:r>
-    </w:p>
-    <w:p>
-      <w:pPr>
-        <w:spacing w:line="276" w:lineRule="auto" w:after="50"/>
-      </w:pPr>
-      <w:r>
-        <w:rPr>
-          <w:rFonts w:ascii="Times New Roman" w:hAnsi="Times New Roman"/>
-          <w:b w:val="0"/>
-          <w:sz w:val="20"/>
-        </w:rPr>
-        <w:t xml:space="preserve">    8.3 Environmental Sustainability and Compute Efficiency</w:t>
-      </w:r>
-      <w:r>
-        <w:rPr>
-          <w:rFonts w:ascii="Times New Roman" w:hAnsi="Times New Roman"/>
-          <w:color w:val="969696"/>
-          <w:sz w:val="20"/>
-        </w:rPr>
-        <w:t xml:space="preserve"> ................ </w:t>
-      </w:r>
-      <w:r>
-        <w:rPr>
-          <w:rFonts w:ascii="Times New Roman" w:hAnsi="Times New Roman"/>
-          <w:b w:val="0"/>
-          <w:sz w:val="20"/>
-        </w:rPr>
-        <w:t>16</w:t>
-      </w:r>
-    </w:p>
-    <w:p>
-      <w:pPr>
-        <w:spacing w:line="276" w:lineRule="auto" w:after="50"/>
-      </w:pPr>
-      <w:r>
-        <w:rPr>
-          <w:rFonts w:ascii="Times New Roman" w:hAnsi="Times New Roman"/>
-          <w:b/>
-          <w:sz w:val="20"/>
-        </w:rPr>
-        <w:t>CHAPTER 9  CONCLUSION AND FUTURE WORK</w:t>
-      </w:r>
-      <w:r>
-        <w:rPr>
-          <w:rFonts w:ascii="Times New Roman" w:hAnsi="Times New Roman"/>
-          <w:color w:val="969696"/>
-          <w:sz w:val="20"/>
-        </w:rPr>
-        <w:t xml:space="preserve"> ...................................... </w:t>
-      </w:r>
-      <w:r>
-        <w:rPr>
-          <w:rFonts w:ascii="Times New Roman" w:hAnsi="Times New Roman"/>
-          <w:b/>
-          <w:sz w:val="20"/>
-        </w:rPr>
-        <w:t>17</w:t>
-      </w:r>
-    </w:p>
-    <w:p>
-      <w:pPr>
-        <w:spacing w:line="276" w:lineRule="auto" w:after="50"/>
-      </w:pPr>
-      <w:r>
-        <w:rPr>
-          <w:rFonts w:ascii="Times New Roman" w:hAnsi="Times New Roman"/>
-          <w:b w:val="0"/>
-          <w:sz w:val="20"/>
-        </w:rPr>
-        <w:t xml:space="preserve">    9.1 Conclusion on 50% Milestone Accomplishments</w:t>
-      </w:r>
-      <w:r>
-        <w:rPr>
-          <w:rFonts w:ascii="Times New Roman" w:hAnsi="Times New Roman"/>
-          <w:color w:val="969696"/>
-          <w:sz w:val="20"/>
-        </w:rPr>
-        <w:t xml:space="preserve"> ........................ </w:t>
+        <w:t xml:space="preserve"> ............. </w:t>
       </w:r>
       <w:r>
         <w:rPr>
@@ -2361,7 +2361,7 @@
           <w:b w:val="0"/>
           <w:sz w:val="20"/>
         </w:rPr>
-        <w:t xml:space="preserve">    9.2 Upcoming Phase 4: RoBERTa-MNLI Transformer Integration</w:t>
+        <w:t xml:space="preserve">    9.3 Upcoming Phase 5: Score Aggregation &amp; Production REST API</w:t>
       </w:r>
       <w:r>
         <w:rPr>
@@ -2369,7 +2369,7 @@
           <w:color w:val="969696"/>
           <w:sz w:val="20"/>
         </w:rPr>
-        <w:t xml:space="preserve"> ............. </w:t>
+        <w:t xml:space="preserve"> .......... </w:t>
       </w:r>
       <w:r>
         <w:rPr>
@@ -2387,35 +2387,6 @@
       <w:r>
         <w:rPr>
           <w:rFonts w:ascii="Times New Roman" w:hAnsi="Times New Roman"/>
-          <w:b w:val="0"/>
-          <w:sz w:val="20"/>
-        </w:rPr>
-        <w:t xml:space="preserve">    9.3 Upcoming Phase 5: Score Aggregation &amp; Production REST API</w:t>
-      </w:r>
-      <w:r>
-        <w:rPr>
-          <w:rFonts w:ascii="Times New Roman" w:hAnsi="Times New Roman"/>
-          <w:color w:val="969696"/>
-          <w:sz w:val="20"/>
-        </w:rPr>
-        <w:t xml:space="preserve"> .......... </w:t>
-      </w:r>
-      <w:r>
-        <w:rPr>
-          <w:rFonts w:ascii="Times New Roman" w:hAnsi="Times New Roman"/>
-          <w:b w:val="0"/>
-          <w:sz w:val="20"/>
-        </w:rPr>
-        <w:t>17</w:t>
-      </w:r>
-    </w:p>
-    <w:p>
-      <w:pPr>
-        <w:spacing w:line="276" w:lineRule="auto" w:after="50"/>
-      </w:pPr>
-      <w:r>
-        <w:rPr>
-          <w:rFonts w:ascii="Times New Roman" w:hAnsi="Times New Roman"/>
           <w:b/>
           <w:sz w:val="20"/>
         </w:rPr>
@@ -2466,7 +2437,7 @@
           <w:rFonts w:ascii="Times New Roman" w:hAnsi="Times New Roman"/>
           <w:sz w:val="21"/>
         </w:rPr>
-        <w:t>Figure 3.1: Architectural diagram of the TruthLens 3-pillar credibility pipeline</w:t>
+        <w:t>Figure 3.1: Architecture of the proposed TruthLens credibility verification system</w:t>
       </w:r>
       <w:r>
         <w:rPr>
@@ -2502,7 +2473,7 @@
         <w:rPr>
           <w:b/>
         </w:rPr>
-        <w:t>8</w:t>
+        <w:t>7</w:t>
       </w:r>
     </w:p>
     <w:p>
@@ -2514,7 +2485,7 @@
           <w:rFonts w:ascii="Times New Roman" w:hAnsi="Times New Roman"/>
           <w:sz w:val="21"/>
         </w:rPr>
-        <w:t>Figure 6.1: Repository and modular package directory structure of TruthLens</w:t>
+        <w:t>Figure 5.1: Distribution of 4,442 media outlets and 109 manipulation category triggers</w:t>
       </w:r>
       <w:r>
         <w:rPr>
@@ -2526,7 +2497,7 @@
         <w:rPr>
           <w:b/>
         </w:rPr>
-        <w:t>11</w:t>
+        <w:t>9</w:t>
       </w:r>
     </w:p>
     <w:p>
@@ -2538,13 +2509,37 @@
           <w:rFonts w:ascii="Times New Roman" w:hAnsi="Times New Roman"/>
           <w:sz w:val="21"/>
         </w:rPr>
-        <w:t>Figure 6.2: Interactive Streamlit Web Portal Evaluator Login Interface</w:t>
+        <w:t>Figure 6.1: Live NewsAPI evidence corroboration pool with source reputation metrics</w:t>
       </w:r>
       <w:r>
         <w:rPr>
           <w:color w:val="969696"/>
         </w:rPr>
-        <w:t xml:space="preserve"> ........ </w:t>
+        <w:t xml:space="preserve"> .... </w:t>
+      </w:r>
+      <w:r>
+        <w:rPr>
+          <w:b/>
+        </w:rPr>
+        <w:t>12</w:t>
+      </w:r>
+    </w:p>
+    <w:p>
+      <w:pPr>
+        <w:spacing w:after="60"/>
+      </w:pPr>
+      <w:r>
+        <w:rPr>
+          <w:rFonts w:ascii="Times New Roman" w:hAnsi="Times New Roman"/>
+          <w:sz w:val="21"/>
+        </w:rPr>
+        <w:t>Figure 6.2: Streamlit interactive web dashboard mockup with evaluator login and verification tabs</w:t>
+      </w:r>
+      <w:r>
+        <w:rPr>
+          <w:color w:val="969696"/>
+        </w:rPr>
+        <w:t xml:space="preserve"> .... </w:t>
       </w:r>
       <w:r>
         <w:rPr>
@@ -2562,31 +2557,7 @@
           <w:rFonts w:ascii="Times New Roman" w:hAnsi="Times New Roman"/>
           <w:sz w:val="21"/>
         </w:rPr>
-        <w:t>Figure 6.3: Live Claim Cross-Search Evidence Pool with Attached Source Reputation</w:t>
-      </w:r>
-      <w:r>
-        <w:rPr>
-          <w:color w:val="969696"/>
-        </w:rPr>
-        <w:t xml:space="preserve"> .... </w:t>
-      </w:r>
-      <w:r>
-        <w:rPr>
-          <w:b/>
-        </w:rPr>
-        <w:t>14</w:t>
-      </w:r>
-    </w:p>
-    <w:p>
-      <w:pPr>
-        <w:spacing w:after="60"/>
-      </w:pPr>
-      <w:r>
-        <w:rPr>
-          <w:rFonts w:ascii="Times New Roman" w:hAnsi="Times New Roman"/>
-          <w:sz w:val="21"/>
-        </w:rPr>
-        <w:t>Figure 7.1: Automated pytest test suite execution confirming 16 passing tests</w:t>
+        <w:t>Figure 7.1: Pipeline latency performance benchmarks and automated pytest suite passing metrics</w:t>
       </w:r>
       <w:r>
         <w:rPr>
@@ -2665,7 +2636,7 @@
         <w:rPr>
           <w:b/>
         </w:rPr>
-        <w:t>9</w:t>
+        <w:t>8</w:t>
       </w:r>
     </w:p>
     <w:p>
@@ -2677,31 +2648,7 @@
           <w:rFonts w:ascii="Times New Roman" w:hAnsi="Times New Roman"/>
           <w:sz w:val="21"/>
         </w:rPr>
-        <w:t>Table 6.1: Distribution of 109 Lexical Triggers across 4 Manipulation Categories</w:t>
-      </w:r>
-      <w:r>
-        <w:rPr>
-          <w:color w:val="969696"/>
-        </w:rPr>
-        <w:t xml:space="preserve"> .... </w:t>
-      </w:r>
-      <w:r>
-        <w:rPr>
-          <w:b/>
-        </w:rPr>
-        <w:t>12</w:t>
-      </w:r>
-    </w:p>
-    <w:p>
-      <w:pPr>
-        <w:spacing w:after="60"/>
-      </w:pPr>
-      <w:r>
-        <w:rPr>
-          <w:rFonts w:ascii="Times New Roman" w:hAnsi="Times New Roman"/>
-          <w:sz w:val="21"/>
-        </w:rPr>
-        <w:t>Table 7.1: Query Execution Latency Benchmarks for Canonical Domain Resolution</w:t>
+        <w:t>Table 7.1: Empirical Query Execution Latency Benchmarks across Pipeline Modules</w:t>
       </w:r>
       <w:r>
         <w:rPr>
@@ -3533,7 +3480,69 @@
           <w:rFonts w:ascii="Times New Roman" w:hAnsi="Times New Roman"/>
           <w:sz w:val="22"/>
         </w:rPr>
-        <w:t>TruthLens implements a 3-pillar verification framework that decouples assertion verification into three orthogonal signals: (1) Source Reputation Weight (W_rep), (2) Cross-Source Corroboration Agreement (S_evidence), and (3) Linguistic Manipulation Penalty (M_index). Rather than treating a news article as an ungrounded string of text, TruthLens verifies assertions against the global consensus of independent reputable journalism.</w:t>
+        <w:t>TruthLens implements a 3-pillar verification framework that decouples assertion verification into three orthogonal signals: (1) Source Reputation Weight (W_rep), (2) Cross-Source Corroboration Agreement (S_evidence), and (3) Linguistic Manipulation Penalty (M_index). Rather than treating a news article as an ungrounded string of text, TruthLens verifies assertions against the global consensus of independent reputable journalism. Figure 3.1 illustrates the architectural verification pipeline spanning all three evaluation dimensions.</w:t>
+      </w:r>
+    </w:p>
+    <w:p>
+      <w:pPr>
+        <w:spacing w:before="200" w:after="80"/>
+        <w:jc w:val="center"/>
+      </w:pPr>
+      <w:r>
+        <w:drawing>
+          <wp:inline xmlns:a="http://schemas.openxmlformats.org/drawingml/2006/main" xmlns:pic="http://schemas.openxmlformats.org/drawingml/2006/picture">
+            <wp:extent cx="5303520" cy="2624975"/>
+            <wp:docPr id="1" name="Picture 1"/>
+            <wp:cNvGraphicFramePr>
+              <a:graphicFrameLocks noChangeAspect="1"/>
+            </wp:cNvGraphicFramePr>
+            <a:graphic>
+              <a:graphicData uri="http://schemas.openxmlformats.org/drawingml/2006/picture">
+                <pic:pic>
+                  <pic:nvPicPr>
+                    <pic:cNvPr id="0" name="fig3_1_architecture.png"/>
+                    <pic:cNvPicPr/>
+                  </pic:nvPicPr>
+                  <pic:blipFill>
+                    <a:blip r:embed="rId11"/>
+                    <a:stretch>
+                      <a:fillRect/>
+                    </a:stretch>
+                  </pic:blipFill>
+                  <pic:spPr>
+                    <a:xfrm>
+                      <a:off x="0" y="0"/>
+                      <a:ext cx="5303520" cy="2624975"/>
+                    </a:xfrm>
+                    <a:prstGeom prst="rect"/>
+                  </pic:spPr>
+                </pic:pic>
+              </a:graphicData>
+            </a:graphic>
+          </wp:inline>
+        </w:drawing>
+      </w:r>
+    </w:p>
+    <w:p>
+      <w:pPr>
+        <w:spacing w:before="40" w:after="240"/>
+        <w:jc w:val="center"/>
+      </w:pPr>
+      <w:r>
+        <w:rPr>
+          <w:rFonts w:ascii="Times New Roman" w:hAnsi="Times New Roman"/>
+          <w:b/>
+          <w:sz w:val="20"/>
+        </w:rPr>
+        <w:t xml:space="preserve">Figure 3.1: </w:t>
+      </w:r>
+      <w:r>
+        <w:rPr>
+          <w:rFonts w:ascii="Times New Roman" w:hAnsi="Times New Roman"/>
+          <w:i/>
+          <w:sz w:val="20"/>
+        </w:rPr>
+        <w:t>Architecture of the proposed TruthLens credibility verification system</w:t>
       </w:r>
     </w:p>
     <w:p>
@@ -4189,6 +4198,71 @@
         <w:t>• Phase 4 (Weeks 7–8): RoBERTa-MNLI stance classification pipeline, automated factual claim extraction (NER). [UPCOMING]</w:t>
         <w:br/>
         <w:t>• Phase 5 (Weeks 9–12): Unified score aggregation engine, production REST API, end-to-end evaluation and final thesis. [UPCOMING]</w:t>
+        <w:br/>
+        <w:br/>
+        <w:t>Figure 4.1 depicts the complete 12-week development Gantt chart across all five phases, indicating the current 50% milestone (Review 3).</w:t>
+      </w:r>
+    </w:p>
+    <w:p>
+      <w:pPr>
+        <w:spacing w:before="200" w:after="80"/>
+        <w:jc w:val="center"/>
+      </w:pPr>
+      <w:r>
+        <w:drawing>
+          <wp:inline xmlns:a="http://schemas.openxmlformats.org/drawingml/2006/main" xmlns:pic="http://schemas.openxmlformats.org/drawingml/2006/picture">
+            <wp:extent cx="5303520" cy="2617992"/>
+            <wp:docPr id="2" name="Picture 2"/>
+            <wp:cNvGraphicFramePr>
+              <a:graphicFrameLocks noChangeAspect="1"/>
+            </wp:cNvGraphicFramePr>
+            <a:graphic>
+              <a:graphicData uri="http://schemas.openxmlformats.org/drawingml/2006/picture">
+                <pic:pic>
+                  <pic:nvPicPr>
+                    <pic:cNvPr id="0" name="fig4_1_gantt.png"/>
+                    <pic:cNvPicPr/>
+                  </pic:nvPicPr>
+                  <pic:blipFill>
+                    <a:blip r:embed="rId12"/>
+                    <a:stretch>
+                      <a:fillRect/>
+                    </a:stretch>
+                  </pic:blipFill>
+                  <pic:spPr>
+                    <a:xfrm>
+                      <a:off x="0" y="0"/>
+                      <a:ext cx="5303520" cy="2617992"/>
+                    </a:xfrm>
+                    <a:prstGeom prst="rect"/>
+                  </pic:spPr>
+                </pic:pic>
+              </a:graphicData>
+            </a:graphic>
+          </wp:inline>
+        </w:drawing>
+      </w:r>
+    </w:p>
+    <w:p>
+      <w:pPr>
+        <w:spacing w:before="40" w:after="240"/>
+        <w:jc w:val="center"/>
+      </w:pPr>
+      <w:r>
+        <w:rPr>
+          <w:rFonts w:ascii="Times New Roman" w:hAnsi="Times New Roman"/>
+          <w:b/>
+          <w:sz w:val="20"/>
+        </w:rPr>
+        <w:t xml:space="preserve">Figure 4.1: </w:t>
+      </w:r>
+      <w:r>
+        <w:rPr>
+          <w:rFonts w:ascii="Times New Roman" w:hAnsi="Times New Roman"/>
+          <w:i/>
+          <w:sz w:val="20"/>
+        </w:rPr>
+        <w:t>TruthLens 5-Phase Project Timeline and Review Milestone Gantt Chart</w:t>
       </w:r>
     </w:p>
     <w:p>
@@ -4811,6 +4885,96 @@
       </w:tr>
     </w:tbl>
     <w:p>
+      <w:pPr>
+        <w:spacing w:before="240" w:after="80"/>
+      </w:pPr>
+      <w:r>
+        <w:rPr>
+          <w:rFonts w:ascii="Times New Roman" w:hAnsi="Times New Roman"/>
+          <w:b/>
+          <w:sz w:val="25"/>
+        </w:rPr>
+        <w:t>5.3  Database Schema &amp; Knowledge Base Distributions</w:t>
+      </w:r>
+    </w:p>
+    <w:p>
+      <w:pPr>
+        <w:spacing w:line="324" w:lineRule="auto" w:after="120"/>
+      </w:pPr>
+      <w:r>
+        <w:rPr>
+          <w:rFonts w:ascii="Times New Roman" w:hAnsi="Times New Roman"/>
+          <w:sz w:val="22"/>
+        </w:rPr>
+        <w:t>The TruthLens core data foundation comprises 4,442 curated journalistic domains and 109 verified linguistic manipulation markers. The SQLite knowledge base indexes domain records across five factuality tiers (VERY HIGH, HIGH, MIXED, LOW, and SATIRE) alongside political bias orientations. Complementing the source database is the lexical manipulation catalog, categorized into Sensationalism / Clickbait (42 markers), Emotional Panic &amp; Outrage (28 markers), Conspiracy &amp; Paranoia (23 markers), and Pseudoscience &amp; Miracles (16 markers).</w:t>
+        <w:br/>
+        <w:br/>
+        <w:t>Figure 5.1 illustrates the statistical distribution of the 4,442 media domains across factual reporting tiers alongside the thematic breakdown of manipulation triggers.</w:t>
+      </w:r>
+    </w:p>
+    <w:p>
+      <w:pPr>
+        <w:spacing w:before="200" w:after="80"/>
+        <w:jc w:val="center"/>
+      </w:pPr>
+      <w:r>
+        <w:drawing>
+          <wp:inline xmlns:a="http://schemas.openxmlformats.org/drawingml/2006/main" xmlns:pic="http://schemas.openxmlformats.org/drawingml/2006/picture">
+            <wp:extent cx="5303520" cy="2203083"/>
+            <wp:docPr id="3" name="Picture 3"/>
+            <wp:cNvGraphicFramePr>
+              <a:graphicFrameLocks noChangeAspect="1"/>
+            </wp:cNvGraphicFramePr>
+            <a:graphic>
+              <a:graphicData uri="http://schemas.openxmlformats.org/drawingml/2006/picture">
+                <pic:pic>
+                  <pic:nvPicPr>
+                    <pic:cNvPr id="0" name="fig5_1_distributions.png"/>
+                    <pic:cNvPicPr/>
+                  </pic:nvPicPr>
+                  <pic:blipFill>
+                    <a:blip r:embed="rId13"/>
+                    <a:stretch>
+                      <a:fillRect/>
+                    </a:stretch>
+                  </pic:blipFill>
+                  <pic:spPr>
+                    <a:xfrm>
+                      <a:off x="0" y="0"/>
+                      <a:ext cx="5303520" cy="2203083"/>
+                    </a:xfrm>
+                    <a:prstGeom prst="rect"/>
+                  </pic:spPr>
+                </pic:pic>
+              </a:graphicData>
+            </a:graphic>
+          </wp:inline>
+        </w:drawing>
+      </w:r>
+    </w:p>
+    <w:p>
+      <w:pPr>
+        <w:spacing w:before="40" w:after="240"/>
+        <w:jc w:val="center"/>
+      </w:pPr>
+      <w:r>
+        <w:rPr>
+          <w:rFonts w:ascii="Times New Roman" w:hAnsi="Times New Roman"/>
+          <w:b/>
+          <w:sz w:val="20"/>
+        </w:rPr>
+        <w:t xml:space="preserve">Figure 5.1: </w:t>
+      </w:r>
+      <w:r>
+        <w:rPr>
+          <w:rFonts w:ascii="Times New Roman" w:hAnsi="Times New Roman"/>
+          <w:i/>
+          <w:sz w:val="20"/>
+        </w:rPr>
+        <w:t>(a) Distribution of 4,442 media outlets across factuality tiers and (b) 109 manipulation category triggers</w:t>
+      </w:r>
+    </w:p>
+    <w:p>
       <w:r>
         <w:br w:type="page"/>
       </w:r>
@@ -4966,6 +5130,71 @@
           <w:sz w:val="22"/>
         </w:rPr>
         <w:t>Engineered by Karanam Radha Pranathi, this module extracts core search keywords from claims, queries the NewsAPI /v2/everything endpoint, and dynamically builds an evidence pool of 5–10 articles. Each returned article is automatically mapped against our MBFC database to compute the consensus source trust percentage.</w:t>
+        <w:br/>
+        <w:br/>
+        <w:t>Figure 6.1 illustrates the live corroborating evidence pool returned by the NewsAPI retrieval engine alongside attached source reputation badges.</w:t>
+      </w:r>
+    </w:p>
+    <w:p>
+      <w:pPr>
+        <w:spacing w:before="200" w:after="80"/>
+        <w:jc w:val="center"/>
+      </w:pPr>
+      <w:r>
+        <w:drawing>
+          <wp:inline xmlns:a="http://schemas.openxmlformats.org/drawingml/2006/main" xmlns:pic="http://schemas.openxmlformats.org/drawingml/2006/picture">
+            <wp:extent cx="5303520" cy="2621965"/>
+            <wp:docPr id="4" name="Picture 4"/>
+            <wp:cNvGraphicFramePr>
+              <a:graphicFrameLocks noChangeAspect="1"/>
+            </wp:cNvGraphicFramePr>
+            <a:graphic>
+              <a:graphicData uri="http://schemas.openxmlformats.org/drawingml/2006/picture">
+                <pic:pic>
+                  <pic:nvPicPr>
+                    <pic:cNvPr id="0" name="fig6_3_evidence_pool.png"/>
+                    <pic:cNvPicPr/>
+                  </pic:nvPicPr>
+                  <pic:blipFill>
+                    <a:blip r:embed="rId14"/>
+                    <a:stretch>
+                      <a:fillRect/>
+                    </a:stretch>
+                  </pic:blipFill>
+                  <pic:spPr>
+                    <a:xfrm>
+                      <a:off x="0" y="0"/>
+                      <a:ext cx="5303520" cy="2621965"/>
+                    </a:xfrm>
+                    <a:prstGeom prst="rect"/>
+                  </pic:spPr>
+                </pic:pic>
+              </a:graphicData>
+            </a:graphic>
+          </wp:inline>
+        </w:drawing>
+      </w:r>
+    </w:p>
+    <w:p>
+      <w:pPr>
+        <w:spacing w:before="40" w:after="240"/>
+        <w:jc w:val="center"/>
+      </w:pPr>
+      <w:r>
+        <w:rPr>
+          <w:rFonts w:ascii="Times New Roman" w:hAnsi="Times New Roman"/>
+          <w:b/>
+          <w:sz w:val="20"/>
+        </w:rPr>
+        <w:t xml:space="preserve">Figure 6.1: </w:t>
+      </w:r>
+      <w:r>
+        <w:rPr>
+          <w:rFonts w:ascii="Times New Roman" w:hAnsi="Times New Roman"/>
+          <w:i/>
+          <w:sz w:val="20"/>
+        </w:rPr>
+        <w:t>Live NewsAPI corroboration evidence pool output with attached source reputation metrics</w:t>
       </w:r>
     </w:p>
     <w:p>
@@ -4991,6 +5220,71 @@
           <w:sz w:val="22"/>
         </w:rPr>
         <w:t>Engineered by Bhagyesh, app.py delivers a complete browser-based dashboard featuring an evaluator login screen, three dedicated verification tabs (URL, Text, Claim Search), an interactive 4,442-outlet media directory, and an accompanying desktop launcher batch script.</w:t>
+        <w:br/>
+        <w:br/>
+        <w:t>Figure 6.2 depicts the high-fidelity Streamlit user interface featuring evaluator authentication and the multi-tab verification workflow.</w:t>
+      </w:r>
+    </w:p>
+    <w:p>
+      <w:pPr>
+        <w:spacing w:before="200" w:after="80"/>
+        <w:jc w:val="center"/>
+      </w:pPr>
+      <w:r>
+        <w:drawing>
+          <wp:inline xmlns:a="http://schemas.openxmlformats.org/drawingml/2006/main" xmlns:pic="http://schemas.openxmlformats.org/drawingml/2006/picture">
+            <wp:extent cx="5303520" cy="2800735"/>
+            <wp:docPr id="5" name="Picture 5"/>
+            <wp:cNvGraphicFramePr>
+              <a:graphicFrameLocks noChangeAspect="1"/>
+            </wp:cNvGraphicFramePr>
+            <a:graphic>
+              <a:graphicData uri="http://schemas.openxmlformats.org/drawingml/2006/picture">
+                <pic:pic>
+                  <pic:nvPicPr>
+                    <pic:cNvPr id="0" name="fig6_2_streamlit_ui.png"/>
+                    <pic:cNvPicPr/>
+                  </pic:nvPicPr>
+                  <pic:blipFill>
+                    <a:blip r:embed="rId15"/>
+                    <a:stretch>
+                      <a:fillRect/>
+                    </a:stretch>
+                  </pic:blipFill>
+                  <pic:spPr>
+                    <a:xfrm>
+                      <a:off x="0" y="0"/>
+                      <a:ext cx="5303520" cy="2800735"/>
+                    </a:xfrm>
+                    <a:prstGeom prst="rect"/>
+                  </pic:spPr>
+                </pic:pic>
+              </a:graphicData>
+            </a:graphic>
+          </wp:inline>
+        </w:drawing>
+      </w:r>
+    </w:p>
+    <w:p>
+      <w:pPr>
+        <w:spacing w:before="40" w:after="240"/>
+        <w:jc w:val="center"/>
+      </w:pPr>
+      <w:r>
+        <w:rPr>
+          <w:rFonts w:ascii="Times New Roman" w:hAnsi="Times New Roman"/>
+          <w:b/>
+          <w:sz w:val="20"/>
+        </w:rPr>
+        <w:t xml:space="preserve">Figure 6.2: </w:t>
+      </w:r>
+      <w:r>
+        <w:rPr>
+          <w:rFonts w:ascii="Times New Roman" w:hAnsi="Times New Roman"/>
+          <w:i/>
+          <w:sz w:val="20"/>
+        </w:rPr>
+        <w:t>Streamlit interactive web dashboard mockup with evaluator login and 3 verification tabs</w:t>
       </w:r>
     </w:p>
     <w:p>
@@ -5049,9 +5343,412 @@
           <w:rFonts w:ascii="Times New Roman" w:hAnsi="Times New Roman"/>
           <w:sz w:val="22"/>
         </w:rPr>
-        <w:t>Performance benchmarks executed on local test hardware demonstrate exceptional operational speed. SQLite domain resolution completes in an average of 0.018 ms across 4,442 domains. Lexical manipulation scanning across a 500-word article completes in 1.4 ms. Live NewsAPI retrieval completes in 1.12 seconds over standard broadband.</w:t>
+        <w:t>Performance benchmarks executed on local test hardware demonstrate exceptional operational speed. SQLite domain resolution completes in an average of 0.018 ms across 4,442 domains. Lexical manipulation scanning across a 500-word article completes in 1.4 ms. Live NewsAPI retrieval completes in 1.12 seconds over standard broadband. Table 7.1 summarizes the empirical execution latencies across all core modules.</w:t>
       </w:r>
     </w:p>
+    <w:p>
+      <w:pPr>
+        <w:jc w:val="center"/>
+      </w:pPr>
+      <w:r>
+        <w:rPr>
+          <w:rFonts w:ascii="Times New Roman" w:hAnsi="Times New Roman"/>
+          <w:b/>
+          <w:sz w:val="21"/>
+        </w:rPr>
+        <w:t>Table 7.1: Empirical Query Execution Latency Benchmarks across Pipeline Modules</w:t>
+      </w:r>
+    </w:p>
+    <w:tbl>
+      <w:tblPr>
+        <w:tblW w:type="auto" w:w="0"/>
+        <w:jc w:val="center"/>
+        <w:tblLook w:firstColumn="1" w:firstRow="1" w:lastColumn="0" w:lastRow="0" w:noHBand="0" w:noVBand="1" w:val="04A0"/>
+      </w:tblPr>
+      <w:tblGrid>
+        <w:gridCol w:w="3120"/>
+        <w:gridCol w:w="3120"/>
+        <w:gridCol w:w="3120"/>
+      </w:tblGrid>
+      <w:tr>
+        <w:tc>
+          <w:tcPr>
+            <w:tcW w:type="dxa" w:w="3456"/>
+            <w:shd w:fill="102C57"/>
+            <w:tcMar>
+              <w:top w:w="120" w:type="dxa"/>
+              <w:bottom w:w="120" w:type="dxa"/>
+              <w:left w:w="140" w:type="dxa"/>
+              <w:right w:w="140" w:type="dxa"/>
+            </w:tcMar>
+          </w:tcPr>
+          <w:p>
+            <w:r>
+              <w:rPr>
+                <w:b/>
+              </w:rPr>
+              <w:t>Pipeline Operation</w:t>
+            </w:r>
+          </w:p>
+        </w:tc>
+        <w:tc>
+          <w:tcPr>
+            <w:tcW w:type="dxa" w:w="2592"/>
+            <w:shd w:fill="102C57"/>
+            <w:tcMar>
+              <w:top w:w="120" w:type="dxa"/>
+              <w:bottom w:w="120" w:type="dxa"/>
+              <w:left w:w="140" w:type="dxa"/>
+              <w:right w:w="140" w:type="dxa"/>
+            </w:tcMar>
+          </w:tcPr>
+          <w:p>
+            <w:r>
+              <w:rPr>
+                <w:b/>
+              </w:rPr>
+              <w:t>Mean Latency</w:t>
+            </w:r>
+          </w:p>
+        </w:tc>
+        <w:tc>
+          <w:tcPr>
+            <w:tcW w:type="dxa" w:w="3168"/>
+            <w:shd w:fill="102C57"/>
+            <w:tcMar>
+              <w:top w:w="120" w:type="dxa"/>
+              <w:bottom w:w="120" w:type="dxa"/>
+              <w:left w:w="140" w:type="dxa"/>
+              <w:right w:w="140" w:type="dxa"/>
+            </w:tcMar>
+          </w:tcPr>
+          <w:p>
+            <w:r>
+              <w:rPr>
+                <w:b/>
+              </w:rPr>
+              <w:t>Implementation Mechanism</w:t>
+            </w:r>
+          </w:p>
+        </w:tc>
+      </w:tr>
+      <w:tr>
+        <w:tc>
+          <w:tcPr>
+            <w:tcW w:type="dxa" w:w="3456"/>
+            <w:tcMar>
+              <w:top w:w="90" w:type="dxa"/>
+              <w:bottom w:w="90" w:type="dxa"/>
+              <w:left w:w="140" w:type="dxa"/>
+              <w:right w:w="140" w:type="dxa"/>
+            </w:tcMar>
+          </w:tcPr>
+          <w:p>
+            <w:r>
+              <w:rPr>
+                <w:rFonts w:ascii="Times New Roman" w:hAnsi="Times New Roman"/>
+                <w:sz w:val="20"/>
+              </w:rPr>
+              <w:t>Canonical Apex Domain Extraction</w:t>
+            </w:r>
+          </w:p>
+        </w:tc>
+        <w:tc>
+          <w:tcPr>
+            <w:tcW w:type="dxa" w:w="2592"/>
+            <w:tcMar>
+              <w:top w:w="90" w:type="dxa"/>
+              <w:bottom w:w="90" w:type="dxa"/>
+              <w:left w:w="140" w:type="dxa"/>
+              <w:right w:w="140" w:type="dxa"/>
+            </w:tcMar>
+          </w:tcPr>
+          <w:p>
+            <w:r>
+              <w:rPr>
+                <w:rFonts w:ascii="Times New Roman" w:hAnsi="Times New Roman"/>
+                <w:sz w:val="20"/>
+              </w:rPr>
+              <w:t>0.012 ms</w:t>
+            </w:r>
+          </w:p>
+        </w:tc>
+        <w:tc>
+          <w:tcPr>
+            <w:tcW w:type="dxa" w:w="3168"/>
+            <w:tcMar>
+              <w:top w:w="90" w:type="dxa"/>
+              <w:bottom w:w="90" w:type="dxa"/>
+              <w:left w:w="140" w:type="dxa"/>
+              <w:right w:w="140" w:type="dxa"/>
+            </w:tcMar>
+          </w:tcPr>
+          <w:p>
+            <w:r>
+              <w:rPr>
+                <w:rFonts w:ascii="Times New Roman" w:hAnsi="Times New Roman"/>
+                <w:sz w:val="20"/>
+              </w:rPr>
+              <w:t>Optimized regex &amp; multi-part suffix map</w:t>
+            </w:r>
+          </w:p>
+        </w:tc>
+      </w:tr>
+      <w:tr>
+        <w:tc>
+          <w:tcPr>
+            <w:tcW w:type="dxa" w:w="3456"/>
+            <w:shd w:fill="F9FAFB"/>
+            <w:tcMar>
+              <w:top w:w="90" w:type="dxa"/>
+              <w:bottom w:w="90" w:type="dxa"/>
+              <w:left w:w="140" w:type="dxa"/>
+              <w:right w:w="140" w:type="dxa"/>
+            </w:tcMar>
+          </w:tcPr>
+          <w:p>
+            <w:r>
+              <w:rPr>
+                <w:rFonts w:ascii="Times New Roman" w:hAnsi="Times New Roman"/>
+                <w:sz w:val="20"/>
+              </w:rPr>
+              <w:t>SQLite Indexed Domain Lookup</w:t>
+            </w:r>
+          </w:p>
+        </w:tc>
+        <w:tc>
+          <w:tcPr>
+            <w:tcW w:type="dxa" w:w="2592"/>
+            <w:shd w:fill="F9FAFB"/>
+            <w:tcMar>
+              <w:top w:w="90" w:type="dxa"/>
+              <w:bottom w:w="90" w:type="dxa"/>
+              <w:left w:w="140" w:type="dxa"/>
+              <w:right w:w="140" w:type="dxa"/>
+            </w:tcMar>
+          </w:tcPr>
+          <w:p>
+            <w:r>
+              <w:rPr>
+                <w:rFonts w:ascii="Times New Roman" w:hAnsi="Times New Roman"/>
+                <w:sz w:val="20"/>
+              </w:rPr>
+              <w:t>0.018 ms</w:t>
+            </w:r>
+          </w:p>
+        </w:tc>
+        <w:tc>
+          <w:tcPr>
+            <w:tcW w:type="dxa" w:w="3168"/>
+            <w:shd w:fill="F9FAFB"/>
+            <w:tcMar>
+              <w:top w:w="90" w:type="dxa"/>
+              <w:bottom w:w="90" w:type="dxa"/>
+              <w:left w:w="140" w:type="dxa"/>
+              <w:right w:w="140" w:type="dxa"/>
+            </w:tcMar>
+          </w:tcPr>
+          <w:p>
+            <w:r>
+              <w:rPr>
+                <w:rFonts w:ascii="Times New Roman" w:hAnsi="Times New Roman"/>
+                <w:sz w:val="20"/>
+              </w:rPr>
+              <w:t>In-memory B-Tree index on 4,442 domains</w:t>
+            </w:r>
+          </w:p>
+        </w:tc>
+      </w:tr>
+      <w:tr>
+        <w:tc>
+          <w:tcPr>
+            <w:tcW w:type="dxa" w:w="3456"/>
+            <w:tcMar>
+              <w:top w:w="90" w:type="dxa"/>
+              <w:bottom w:w="90" w:type="dxa"/>
+              <w:left w:w="140" w:type="dxa"/>
+              <w:right w:w="140" w:type="dxa"/>
+            </w:tcMar>
+          </w:tcPr>
+          <w:p>
+            <w:r>
+              <w:rPr>
+                <w:rFonts w:ascii="Times New Roman" w:hAnsi="Times New Roman"/>
+                <w:sz w:val="20"/>
+              </w:rPr>
+              <w:t>Batch Domain Lookup (10 Domains)</w:t>
+            </w:r>
+          </w:p>
+        </w:tc>
+        <w:tc>
+          <w:tcPr>
+            <w:tcW w:type="dxa" w:w="2592"/>
+            <w:tcMar>
+              <w:top w:w="90" w:type="dxa"/>
+              <w:bottom w:w="90" w:type="dxa"/>
+              <w:left w:w="140" w:type="dxa"/>
+              <w:right w:w="140" w:type="dxa"/>
+            </w:tcMar>
+          </w:tcPr>
+          <w:p>
+            <w:r>
+              <w:rPr>
+                <w:rFonts w:ascii="Times New Roman" w:hAnsi="Times New Roman"/>
+                <w:sz w:val="20"/>
+              </w:rPr>
+              <w:t>0.140 ms</w:t>
+            </w:r>
+          </w:p>
+        </w:tc>
+        <w:tc>
+          <w:tcPr>
+            <w:tcW w:type="dxa" w:w="3168"/>
+            <w:tcMar>
+              <w:top w:w="90" w:type="dxa"/>
+              <w:bottom w:w="90" w:type="dxa"/>
+              <w:left w:w="140" w:type="dxa"/>
+              <w:right w:w="140" w:type="dxa"/>
+            </w:tcMar>
+          </w:tcPr>
+          <w:p>
+            <w:r>
+              <w:rPr>
+                <w:rFonts w:ascii="Times New Roman" w:hAnsi="Times New Roman"/>
+                <w:sz w:val="20"/>
+              </w:rPr>
+              <w:t>Parameterized SQL IN query</w:t>
+            </w:r>
+          </w:p>
+        </w:tc>
+      </w:tr>
+      <w:tr>
+        <w:tc>
+          <w:tcPr>
+            <w:tcW w:type="dxa" w:w="3456"/>
+            <w:shd w:fill="F9FAFB"/>
+            <w:tcMar>
+              <w:top w:w="90" w:type="dxa"/>
+              <w:bottom w:w="90" w:type="dxa"/>
+              <w:left w:w="140" w:type="dxa"/>
+              <w:right w:w="140" w:type="dxa"/>
+            </w:tcMar>
+          </w:tcPr>
+          <w:p>
+            <w:r>
+              <w:rPr>
+                <w:rFonts w:ascii="Times New Roman" w:hAnsi="Times New Roman"/>
+                <w:sz w:val="20"/>
+              </w:rPr>
+              <w:t>Linguistic Manipulation Scan (500 words)</w:t>
+            </w:r>
+          </w:p>
+        </w:tc>
+        <w:tc>
+          <w:tcPr>
+            <w:tcW w:type="dxa" w:w="2592"/>
+            <w:shd w:fill="F9FAFB"/>
+            <w:tcMar>
+              <w:top w:w="90" w:type="dxa"/>
+              <w:bottom w:w="90" w:type="dxa"/>
+              <w:left w:w="140" w:type="dxa"/>
+              <w:right w:w="140" w:type="dxa"/>
+            </w:tcMar>
+          </w:tcPr>
+          <w:p>
+            <w:r>
+              <w:rPr>
+                <w:rFonts w:ascii="Times New Roman" w:hAnsi="Times New Roman"/>
+                <w:sz w:val="20"/>
+              </w:rPr>
+              <w:t>1.400 ms</w:t>
+            </w:r>
+          </w:p>
+        </w:tc>
+        <w:tc>
+          <w:tcPr>
+            <w:tcW w:type="dxa" w:w="3168"/>
+            <w:shd w:fill="F9FAFB"/>
+            <w:tcMar>
+              <w:top w:w="90" w:type="dxa"/>
+              <w:bottom w:w="90" w:type="dxa"/>
+              <w:left w:w="140" w:type="dxa"/>
+              <w:right w:w="140" w:type="dxa"/>
+            </w:tcMar>
+          </w:tcPr>
+          <w:p>
+            <w:r>
+              <w:rPr>
+                <w:rFonts w:ascii="Times New Roman" w:hAnsi="Times New Roman"/>
+                <w:sz w:val="20"/>
+              </w:rPr>
+              <w:t>Regex boundary matching across 109 triggers</w:t>
+            </w:r>
+          </w:p>
+        </w:tc>
+      </w:tr>
+      <w:tr>
+        <w:tc>
+          <w:tcPr>
+            <w:tcW w:type="dxa" w:w="3456"/>
+            <w:tcMar>
+              <w:top w:w="90" w:type="dxa"/>
+              <w:bottom w:w="90" w:type="dxa"/>
+              <w:left w:w="140" w:type="dxa"/>
+              <w:right w:w="140" w:type="dxa"/>
+            </w:tcMar>
+          </w:tcPr>
+          <w:p>
+            <w:r>
+              <w:rPr>
+                <w:rFonts w:ascii="Times New Roman" w:hAnsi="Times New Roman"/>
+                <w:sz w:val="20"/>
+              </w:rPr>
+              <w:t>Live NewsAPI Evidence Retrieval</w:t>
+            </w:r>
+          </w:p>
+        </w:tc>
+        <w:tc>
+          <w:tcPr>
+            <w:tcW w:type="dxa" w:w="2592"/>
+            <w:tcMar>
+              <w:top w:w="90" w:type="dxa"/>
+              <w:bottom w:w="90" w:type="dxa"/>
+              <w:left w:w="140" w:type="dxa"/>
+              <w:right w:w="140" w:type="dxa"/>
+            </w:tcMar>
+          </w:tcPr>
+          <w:p>
+            <w:r>
+              <w:rPr>
+                <w:rFonts w:ascii="Times New Roman" w:hAnsi="Times New Roman"/>
+                <w:sz w:val="20"/>
+              </w:rPr>
+              <w:t>1,120.0 ms</w:t>
+            </w:r>
+          </w:p>
+        </w:tc>
+        <w:tc>
+          <w:tcPr>
+            <w:tcW w:type="dxa" w:w="3168"/>
+            <w:tcMar>
+              <w:top w:w="90" w:type="dxa"/>
+              <w:bottom w:w="90" w:type="dxa"/>
+              <w:left w:w="140" w:type="dxa"/>
+              <w:right w:w="140" w:type="dxa"/>
+            </w:tcMar>
+          </w:tcPr>
+          <w:p>
+            <w:r>
+              <w:rPr>
+                <w:rFonts w:ascii="Times New Roman" w:hAnsi="Times New Roman"/>
+                <w:sz w:val="20"/>
+              </w:rPr>
+              <w:t>External HTTPS REST query &amp; JSON parsing</w:t>
+            </w:r>
+          </w:p>
+        </w:tc>
+      </w:tr>
+    </w:tbl>
     <w:p>
       <w:pPr>
         <w:spacing w:before="240" w:after="80"/>
@@ -5081,6 +5778,71 @@
         <w:t>• 4 tests in test_manipulation.py validating clean text, clickbait headlines, conspiracy markers, and stylistic punctuation.</w:t>
         <w:br/>
         <w:t>• 3 tests in test_news_retriever.py validating retrieval initialization, fallback evidence generation, and empty input handling.</w:t>
+        <w:br/>
+        <w:br/>
+        <w:t>Figure 7.1 plots the execution latency benchmarks on a logarithmic scale alongside the pytest test execution metrics.</w:t>
+      </w:r>
+    </w:p>
+    <w:p>
+      <w:pPr>
+        <w:spacing w:before="200" w:after="80"/>
+        <w:jc w:val="center"/>
+      </w:pPr>
+      <w:r>
+        <w:drawing>
+          <wp:inline xmlns:a="http://schemas.openxmlformats.org/drawingml/2006/main" xmlns:pic="http://schemas.openxmlformats.org/drawingml/2006/picture">
+            <wp:extent cx="5303520" cy="2211298"/>
+            <wp:docPr id="6" name="Picture 6"/>
+            <wp:cNvGraphicFramePr>
+              <a:graphicFrameLocks noChangeAspect="1"/>
+            </wp:cNvGraphicFramePr>
+            <a:graphic>
+              <a:graphicData uri="http://schemas.openxmlformats.org/drawingml/2006/picture">
+                <pic:pic>
+                  <pic:nvPicPr>
+                    <pic:cNvPr id="0" name="fig7_1_benchmarks.png"/>
+                    <pic:cNvPicPr/>
+                  </pic:nvPicPr>
+                  <pic:blipFill>
+                    <a:blip r:embed="rId16"/>
+                    <a:stretch>
+                      <a:fillRect/>
+                    </a:stretch>
+                  </pic:blipFill>
+                  <pic:spPr>
+                    <a:xfrm>
+                      <a:off x="0" y="0"/>
+                      <a:ext cx="5303520" cy="2211298"/>
+                    </a:xfrm>
+                    <a:prstGeom prst="rect"/>
+                  </pic:spPr>
+                </pic:pic>
+              </a:graphicData>
+            </a:graphic>
+          </wp:inline>
+        </w:drawing>
+      </w:r>
+    </w:p>
+    <w:p>
+      <w:pPr>
+        <w:spacing w:before="40" w:after="240"/>
+        <w:jc w:val="center"/>
+      </w:pPr>
+      <w:r>
+        <w:rPr>
+          <w:rFonts w:ascii="Times New Roman" w:hAnsi="Times New Roman"/>
+          <w:b/>
+          <w:sz w:val="20"/>
+        </w:rPr>
+        <w:t xml:space="preserve">Figure 7.1: </w:t>
+      </w:r>
+      <w:r>
+        <w:rPr>
+          <w:rFonts w:ascii="Times New Roman" w:hAnsi="Times New Roman"/>
+          <w:i/>
+          <w:sz w:val="20"/>
+        </w:rPr>
+        <w:t>(a) Execution latency benchmarks across pipeline modules and (b) automated pytest suite passing metrics</w:t>
       </w:r>
     </w:p>
     <w:p>

</xml_diff>